<commit_message>
fix: reff space weirdness, add: kami or engkau option
</commit_message>
<xml_diff>
--- a/backend/public/Liturgi_Template.docx
+++ b/backend/public/Liturgi_Template.docx
@@ -29,15 +29,11 @@
       </w:pPr>
       <w:r>
         <w:rPr/>
-        <w:t>{</w:t>
-      </w:r>
-      <w:r>
-        <w:rPr/>
-        <w:t>Tanggal</w:t>
-      </w:r>
-      <w:r>
-        <w:rPr/>
-        <w:t>}</w:t>
+        <w:t xml:space="preserve">Minggu, </w:t>
+      </w:r>
+      <w:r>
+        <w:rPr/>
+        <w:t>{Tanggal}</w:t>
       </w:r>
     </w:p>
     <w:p>
@@ -64,15 +60,7 @@
       </w:pPr>
       <w:r>
         <w:rPr/>
-        <w:t>{</w:t>
-      </w:r>
-      <w:r>
-        <w:rPr/>
-        <w:t>Tema</w:t>
-      </w:r>
-      <w:r>
-        <w:rPr/>
-        <w:t>}</w:t>
+        <w:t>{Tema}</w:t>
       </w:r>
     </w:p>
     <w:p>
@@ -931,15 +919,7 @@
       </w:pPr>
       <w:r>
         <w:rPr/>
-        <w:t>{</w:t>
-      </w:r>
-      <w:r>
-        <w:rPr/>
-        <w:t>Tema</w:t>
-      </w:r>
-      <w:r>
-        <w:rPr/>
-        <w:t>}</w:t>
+        <w:t>{Tema}</w:t>
       </w:r>
     </w:p>
     <w:p>
@@ -1313,6 +1293,13 @@
           <w:rStyle w:val="BodyNormalChar"/>
         </w:rPr>
         <w:tab/>
+      </w:r>
+      <w:r>
+        <w:rPr>
+          <w:rStyle w:val="BodyNormalChar"/>
+          <w:b/>
+          <w:bCs/>
+        </w:rPr>
         <w:t>{</w:t>
       </w:r>
       <w:r>
@@ -2881,7 +2868,71 @@
           <w:i/>
           <w:szCs w:val="24"/>
         </w:rPr>
-        <w:t>“Tuhan memberkati kita dan melindungi kita,</w:t>
+        <w:t xml:space="preserve">“Tuhan memberkati </w:t>
+      </w:r>
+      <w:r>
+        <w:rPr>
+          <w:rFonts w:eastAsia="SimSun" w:cs="Segoe UI" w:ascii="Segoe UI" w:hAnsi="Segoe UI"/>
+          <w:i/>
+          <w:szCs w:val="24"/>
+        </w:rPr>
+        <w:t>{</w:t>
+      </w:r>
+      <w:r>
+        <w:rPr>
+          <w:rFonts w:eastAsia="SimSun" w:cs="Segoe UI" w:ascii="Segoe UI" w:hAnsi="Segoe UI"/>
+          <w:i/>
+          <w:szCs w:val="24"/>
+        </w:rPr>
+        <w:t>kita</w:t>
+      </w:r>
+      <w:r>
+        <w:rPr>
+          <w:rFonts w:eastAsia="SimSun" w:cs="Segoe UI" w:ascii="Segoe UI" w:hAnsi="Segoe UI"/>
+          <w:i/>
+          <w:szCs w:val="24"/>
+        </w:rPr>
+        <w:t>}</w:t>
+      </w:r>
+      <w:r>
+        <w:rPr>
+          <w:rFonts w:eastAsia="SimSun" w:cs="Segoe UI" w:ascii="Segoe UI" w:hAnsi="Segoe UI"/>
+          <w:i/>
+          <w:szCs w:val="24"/>
+        </w:rPr>
+        <w:t xml:space="preserve"> dan melindungi </w:t>
+      </w:r>
+      <w:r>
+        <w:rPr>
+          <w:rFonts w:eastAsia="SimSun" w:cs="Segoe UI" w:ascii="Segoe UI" w:hAnsi="Segoe UI"/>
+          <w:i/>
+          <w:szCs w:val="24"/>
+        </w:rPr>
+        <w:t>{</w:t>
+      </w:r>
+      <w:r>
+        <w:rPr>
+          <w:rFonts w:eastAsia="SimSun" w:cs="Segoe UI" w:ascii="Segoe UI" w:hAnsi="Segoe UI"/>
+          <w:i/>
+          <w:szCs w:val="24"/>
+        </w:rPr>
+        <w:t>kita</w:t>
+      </w:r>
+      <w:r>
+        <w:rPr>
+          <w:rFonts w:eastAsia="SimSun" w:cs="Segoe UI" w:ascii="Segoe UI" w:hAnsi="Segoe UI"/>
+          <w:i/>
+          <w:szCs w:val="24"/>
+        </w:rPr>
+        <w:t>}</w:t>
+      </w:r>
+      <w:r>
+        <w:rPr>
+          <w:rFonts w:eastAsia="SimSun" w:cs="Segoe UI" w:ascii="Segoe UI" w:hAnsi="Segoe UI"/>
+          <w:i/>
+          <w:szCs w:val="24"/>
+        </w:rPr>
+        <w:t>,</w:t>
       </w:r>
     </w:p>
     <w:p>
@@ -2902,7 +2953,39 @@
           <w:i/>
           <w:szCs w:val="24"/>
         </w:rPr>
-        <w:t>Tuhan menyinari kita dengan wajah-Nya</w:t>
+        <w:t xml:space="preserve">Tuhan menyinari </w:t>
+      </w:r>
+      <w:r>
+        <w:rPr>
+          <w:rFonts w:eastAsia="SimSun" w:cs="Segoe UI" w:ascii="Segoe UI" w:hAnsi="Segoe UI"/>
+          <w:i/>
+          <w:szCs w:val="24"/>
+        </w:rPr>
+        <w:t>{</w:t>
+      </w:r>
+      <w:r>
+        <w:rPr>
+          <w:rFonts w:eastAsia="SimSun" w:cs="Segoe UI" w:ascii="Segoe UI" w:hAnsi="Segoe UI"/>
+          <w:i/>
+          <w:szCs w:val="24"/>
+        </w:rPr>
+        <w:t>kita</w:t>
+      </w:r>
+      <w:r>
+        <w:rPr>
+          <w:rFonts w:eastAsia="SimSun" w:cs="Segoe UI" w:ascii="Segoe UI" w:hAnsi="Segoe UI"/>
+          <w:i/>
+          <w:szCs w:val="24"/>
+        </w:rPr>
+        <w:t>}</w:t>
+      </w:r>
+      <w:r>
+        <w:rPr>
+          <w:rFonts w:eastAsia="SimSun" w:cs="Segoe UI" w:ascii="Segoe UI" w:hAnsi="Segoe UI"/>
+          <w:i/>
+          <w:szCs w:val="24"/>
+        </w:rPr>
+        <w:t xml:space="preserve"> dengan wajah-Nya</w:t>
       </w:r>
     </w:p>
     <w:p>
@@ -2923,7 +3006,39 @@
           <w:i/>
           <w:szCs w:val="24"/>
         </w:rPr>
-        <w:t>dan memberi kita kasih karunia,</w:t>
+        <w:t xml:space="preserve">dan memberi </w:t>
+      </w:r>
+      <w:r>
+        <w:rPr>
+          <w:rFonts w:eastAsia="SimSun" w:cs="Segoe UI" w:ascii="Segoe UI" w:hAnsi="Segoe UI"/>
+          <w:i/>
+          <w:szCs w:val="24"/>
+        </w:rPr>
+        <w:t>{</w:t>
+      </w:r>
+      <w:r>
+        <w:rPr>
+          <w:rFonts w:eastAsia="SimSun" w:cs="Segoe UI" w:ascii="Segoe UI" w:hAnsi="Segoe UI"/>
+          <w:i/>
+          <w:szCs w:val="24"/>
+        </w:rPr>
+        <w:t>kita</w:t>
+      </w:r>
+      <w:r>
+        <w:rPr>
+          <w:rFonts w:eastAsia="SimSun" w:cs="Segoe UI" w:ascii="Segoe UI" w:hAnsi="Segoe UI"/>
+          <w:i/>
+          <w:szCs w:val="24"/>
+        </w:rPr>
+        <w:t>}</w:t>
+      </w:r>
+      <w:r>
+        <w:rPr>
+          <w:rFonts w:eastAsia="SimSun" w:cs="Segoe UI" w:ascii="Segoe UI" w:hAnsi="Segoe UI"/>
+          <w:i/>
+          <w:szCs w:val="24"/>
+        </w:rPr>
+        <w:t xml:space="preserve"> kasih karunia,</w:t>
       </w:r>
     </w:p>
     <w:p>
@@ -2944,7 +3059,31 @@
           <w:i/>
           <w:szCs w:val="24"/>
         </w:rPr>
-        <w:t>Tuhan menghadapkan wajah-Nya kepada kita</w:t>
+        <w:t>Tuhan menghadapkan wajah-Nya kepada</w:t>
+      </w:r>
+      <w:r>
+        <w:rPr>
+          <w:rFonts w:eastAsia="SimSun" w:cs="Segoe UI" w:ascii="Segoe UI" w:hAnsi="Segoe UI"/>
+          <w:i/>
+          <w:szCs w:val="24"/>
+        </w:rPr>
+        <w:t>{</w:t>
+      </w:r>
+      <w:r>
+        <w:rPr>
+          <w:rFonts w:eastAsia="SimSun" w:cs="Segoe UI" w:ascii="Segoe UI" w:hAnsi="Segoe UI"/>
+          <w:i/>
+          <w:szCs w:val="24"/>
+        </w:rPr>
+        <w:t>kita</w:t>
+      </w:r>
+      <w:r>
+        <w:rPr>
+          <w:rFonts w:eastAsia="SimSun" w:cs="Segoe UI" w:ascii="Segoe UI" w:hAnsi="Segoe UI"/>
+          <w:i/>
+          <w:szCs w:val="24"/>
+        </w:rPr>
+        <w:t>WithSpace}</w:t>
       </w:r>
     </w:p>
     <w:p>
@@ -2965,7 +3104,23 @@
           <w:i/>
           <w:szCs w:val="24"/>
         </w:rPr>
-        <w:t>dan memberi kita damai sejahtera”</w:t>
+        <w:t xml:space="preserve">dan memberi </w:t>
+      </w:r>
+      <w:r>
+        <w:rPr>
+          <w:rFonts w:eastAsia="SimSun" w:cs="Segoe UI" w:ascii="Segoe UI" w:hAnsi="Segoe UI"/>
+          <w:i/>
+          <w:szCs w:val="24"/>
+        </w:rPr>
+        <w:t>{kita}</w:t>
+      </w:r>
+      <w:r>
+        <w:rPr>
+          <w:rFonts w:eastAsia="SimSun" w:cs="Segoe UI" w:ascii="Segoe UI" w:hAnsi="Segoe UI"/>
+          <w:i/>
+          <w:szCs w:val="24"/>
+        </w:rPr>
+        <w:t xml:space="preserve"> damai sejahtera”</w:t>
       </w:r>
     </w:p>
     <w:p>

</xml_diff>